<commit_message>
feat: Política de Controle Tecnológico R01 com Anexo 6 (parâmetros de controle e aceitação por material)
Co-Authored-By: Claude Fable 5.1 <noreply@anthropic.com>
</commit_message>
<xml_diff>
--- a/politica-controle-tecnologico/arquivos/Anexo_1_Amostragem_Guarda_Amostras_R00.docx
+++ b/politica-controle-tecnologico/arquivos/Anexo_1_Amostragem_Guarda_Amostras_R00.docx
@@ -1349,7 +1349,7 @@
               <w:rPr>
                 <w:sz w:val="18"/>
               </w:rPr>
-              <w:t>Campanha de recebimento por segmento concluído, malha do projeto ou do PCT</w:t>
+              <w:t>Verificação de 1 ponto a cada 5 da EXECUTORA e campanha de recebimento por segmento concluído, na malha do Anexo 6</w:t>
             </w:r>
           </w:p>
         </w:tc>
@@ -1365,7 +1365,7 @@
               <w:rPr>
                 <w:sz w:val="18"/>
               </w:rPr>
-              <w:t>Executada pelo laboratório contratado; não há controle da EXECUTORA a verificar</w:t>
+              <w:t>A EXECUTORA faz o controle construtivo do Anexo 6; o laboratório contratado verifica e executa a campanha de recebimento</w:t>
             </w:r>
           </w:p>
         </w:tc>
@@ -1421,7 +1421,11 @@
         <w:spacing w:after="120"/>
       </w:pPr>
       <w:r>
-        <w:t>Formato: AM-ZZ-OSNNN-AAAAMMDD-SSS-F, em que ZZ é a zona do acervo (Z00 a Z09), OSNNN é a ordem de serviço, AAAAMMDD é a data da coleta, SSS é o sequencial do dia e F é a finalidade: C (controle da execução), V (verificação independente), P (contraprova) ou I (investigação). A contraprova recebe o mesmo identificador da amostra ensaiada, com a finalidade P.</w:t>
+        <w:t xml:space="preserve">Formato: AM-ZZ-OSNNN-AAAAMMDD-SSS-F, em que ZZ é a zona do acervo (Z00 a Z09), OSNNN é a ordem de serviço, AAAAMMDD é a data da coleta, SSS é o sequencial do dia e F é a finalidade: C </w:t>
+      </w:r>
+      <w:r>
+        <w:lastRenderedPageBreak/>
+        <w:t>(controle da execução), V (verificação independente), P (contraprova) ou I (investigação). A contraprova recebe o mesmo identificador da amostra ensaiada, com a finalidade P.</w:t>
       </w:r>
     </w:p>
     <w:p>
@@ -1429,7 +1433,6 @@
         <w:spacing w:after="120"/>
       </w:pPr>
       <w:r>
-        <w:lastRenderedPageBreak/>
         <w:t>O identificador é gravado na amostra, no lacre, na ficha de custódia, no laudo e no banco de dados. Não é reutilizado nem renumerado.</w:t>
       </w:r>
     </w:p>
@@ -2121,6 +2124,7 @@
         <w:rPr>
           <w:rFonts w:ascii="Calibri" w:eastAsia="Calibri" w:hAnsi="Calibri" w:cs="Calibri"/>
         </w:rPr>
+        <w:lastRenderedPageBreak/>
         <w:t>7. Condições de validade da amostra</w:t>
       </w:r>
     </w:p>
@@ -2129,11 +2133,7 @@
         <w:spacing w:after="120"/>
       </w:pPr>
       <w:r>
-        <w:t xml:space="preserve">Amostra é inválida quando: o identificador está ausente ou ilegível; o lacre foi violado sem registro; a cadeia de custódia tem lacuna; a condição de transporte ou guarda comprometeu o material; ou a </w:t>
-      </w:r>
-      <w:r>
-        <w:lastRenderedPageBreak/>
-        <w:t>coleta não seguiu o método. A invalidade é registrada, a amostra é segregada e a coleta é repetida. O resultado de amostra inválida não entra na decisão nem na estatística.</w:t>
+        <w:t>Amostra é inválida quando: o identificador está ausente ou ilegível; o lacre foi violado sem registro; a cadeia de custódia tem lacuna; a condição de transporte ou guarda comprometeu o material; ou a coleta não seguiu o método. A invalidade é registrada, a amostra é segregada e a coleta é repetida. O resultado de amostra inválida não entra na decisão nem na estatística.</w:t>
       </w:r>
     </w:p>
     <w:sectPr>
@@ -2356,7 +2356,7 @@
         <w:noProof/>
       </w:rPr>
       <w:drawing>
-        <wp:inline distT="0" distB="0" distL="0" distR="0" wp14:anchorId="09D50972" wp14:editId="4CD80EB7">
+        <wp:inline distT="0" distB="0" distL="0" distR="0" wp14:anchorId="55E24696" wp14:editId="64BAD5BC">
           <wp:extent cx="1872000" cy="501930"/>
           <wp:effectExtent l="0" t="0" r="0" b="0"/>
           <wp:docPr id="1" name="Picture 1"/>
@@ -2568,31 +2568,31 @@
       </w:rPr>
     </w:lvl>
   </w:abstractNum>
-  <w:num w:numId="1" w16cid:durableId="1295064936">
+  <w:num w:numId="1" w16cid:durableId="1796947342">
     <w:abstractNumId w:val="8"/>
   </w:num>
-  <w:num w:numId="2" w16cid:durableId="1422753627">
+  <w:num w:numId="2" w16cid:durableId="1768189711">
     <w:abstractNumId w:val="6"/>
   </w:num>
-  <w:num w:numId="3" w16cid:durableId="1370688048">
+  <w:num w:numId="3" w16cid:durableId="1420371282">
     <w:abstractNumId w:val="5"/>
   </w:num>
-  <w:num w:numId="4" w16cid:durableId="606350682">
+  <w:num w:numId="4" w16cid:durableId="1758094962">
     <w:abstractNumId w:val="4"/>
   </w:num>
-  <w:num w:numId="5" w16cid:durableId="346294354">
+  <w:num w:numId="5" w16cid:durableId="25062920">
     <w:abstractNumId w:val="7"/>
   </w:num>
-  <w:num w:numId="6" w16cid:durableId="1073284927">
+  <w:num w:numId="6" w16cid:durableId="1188102217">
     <w:abstractNumId w:val="3"/>
   </w:num>
-  <w:num w:numId="7" w16cid:durableId="1681275955">
+  <w:num w:numId="7" w16cid:durableId="300311612">
     <w:abstractNumId w:val="2"/>
   </w:num>
-  <w:num w:numId="8" w16cid:durableId="991833304">
+  <w:num w:numId="8" w16cid:durableId="1603876653">
     <w:abstractNumId w:val="1"/>
   </w:num>
-  <w:num w:numId="9" w16cid:durableId="2005694080">
+  <w:num w:numId="9" w16cid:durableId="965280468">
     <w:abstractNumId w:val="0"/>
   </w:num>
 </w:numbering>

</xml_diff>